<commit_message>
Update CV Profile and Project section
</commit_message>
<xml_diff>
--- a/Nazmul_Hussain_CV.docx
+++ b/Nazmul_Hussain_CV.docx
@@ -298,133 +298,14 @@
           <w:sz w:val="21"/>
           <w:szCs w:val="21"/>
         </w:rPr>
-        <w:t xml:space="preserve">Junior C#/.NET developer </w:t>
-      </w:r>
-      <w:r>
-        <w:rPr>
-          <w:sz w:val="21"/>
-          <w:szCs w:val="21"/>
-        </w:rPr>
-        <w:t xml:space="preserve">who recently </w:t>
-      </w:r>
-      <w:r>
-        <w:rPr>
-          <w:sz w:val="21"/>
-          <w:szCs w:val="21"/>
-        </w:rPr>
-        <w:t>complet</w:t>
-      </w:r>
-      <w:r>
-        <w:rPr>
-          <w:sz w:val="21"/>
-          <w:szCs w:val="21"/>
-        </w:rPr>
-        <w:t>ed</w:t>
-      </w:r>
-      <w:r>
-        <w:rPr>
-          <w:sz w:val="21"/>
-          <w:szCs w:val="21"/>
-        </w:rPr>
-        <w:t xml:space="preserve"> the Northcoders </w:t>
-      </w:r>
-      <w:r>
-        <w:rPr>
-          <w:sz w:val="21"/>
-          <w:szCs w:val="21"/>
-        </w:rPr>
-        <w:t xml:space="preserve">Enterprise Engineering </w:t>
-      </w:r>
-      <w:r>
-        <w:rPr>
-          <w:sz w:val="21"/>
-          <w:szCs w:val="21"/>
-        </w:rPr>
-        <w:t xml:space="preserve">bootcamp, with a strong interest in technology and software development. </w:t>
-      </w:r>
-      <w:r>
-        <w:rPr>
-          <w:sz w:val="21"/>
-          <w:szCs w:val="21"/>
-        </w:rPr>
-        <w:t>My curiosity about technology grew through</w:t>
-      </w:r>
-      <w:r>
-        <w:rPr>
-          <w:sz w:val="21"/>
-          <w:szCs w:val="21"/>
-        </w:rPr>
-        <w:t xml:space="preserve"> </w:t>
-      </w:r>
-      <w:r>
-        <w:rPr>
-          <w:sz w:val="21"/>
-          <w:szCs w:val="21"/>
-        </w:rPr>
-        <w:t>building and upgrading my PC,</w:t>
-      </w:r>
-      <w:r>
-        <w:rPr>
-          <w:sz w:val="21"/>
-          <w:szCs w:val="21"/>
-        </w:rPr>
-        <w:t xml:space="preserve"> </w:t>
-      </w:r>
-      <w:r>
-        <w:rPr>
-          <w:sz w:val="21"/>
-          <w:szCs w:val="21"/>
-        </w:rPr>
-        <w:t xml:space="preserve">which </w:t>
-      </w:r>
-      <w:r>
-        <w:rPr>
-          <w:sz w:val="21"/>
-          <w:szCs w:val="21"/>
-        </w:rPr>
-        <w:t>spark</w:t>
-      </w:r>
-      <w:r>
-        <w:rPr>
-          <w:sz w:val="21"/>
-          <w:szCs w:val="21"/>
-        </w:rPr>
-        <w:t>ed</w:t>
-      </w:r>
-      <w:r>
-        <w:rPr>
-          <w:sz w:val="21"/>
-          <w:szCs w:val="21"/>
-        </w:rPr>
-        <w:t xml:space="preserve"> my interest in problem</w:t>
-      </w:r>
-      <w:r>
-        <w:rPr>
-          <w:sz w:val="21"/>
-          <w:szCs w:val="21"/>
-        </w:rPr>
-        <w:t>-</w:t>
-      </w:r>
-      <w:r>
-        <w:rPr>
-          <w:sz w:val="21"/>
-          <w:szCs w:val="21"/>
-        </w:rPr>
-        <w:t>solving and</w:t>
-      </w:r>
-      <w:r>
-        <w:rPr>
-          <w:sz w:val="21"/>
-          <w:szCs w:val="21"/>
-        </w:rPr>
-        <w:t xml:space="preserve"> in</w:t>
-      </w:r>
-      <w:r>
-        <w:rPr>
-          <w:sz w:val="21"/>
-          <w:szCs w:val="21"/>
-        </w:rPr>
-        <w:t xml:space="preserve"> how software systems work.</w:t>
+        <w:t xml:space="preserve">Junior C#/.NET developer who recently completed the Northcoders Enterprise Engineering bootcamp, with a strong interest in technology and software development. My curiosity about technology grew through building and upgrading my PC, sparking my interest in problem-solving and how software systems work. </w:t>
+      </w:r>
+      <w:r>
+        <w:rPr>
+          <w:sz w:val="21"/>
+          <w:szCs w:val="21"/>
+        </w:rPr>
+        <w:t>Northcoders helped me further develop my computing background and build on my data-focused work experience.</w:t>
       </w:r>
     </w:p>
     <w:p>
@@ -453,56 +334,84 @@
           <w:sz w:val="21"/>
           <w:szCs w:val="21"/>
         </w:rPr>
-        <w:t>Although software development was something I had</w:t>
-      </w:r>
-      <w:r>
-        <w:rPr>
-          <w:sz w:val="21"/>
-          <w:szCs w:val="21"/>
-        </w:rPr>
-        <w:t xml:space="preserve"> </w:t>
-      </w:r>
-      <w:r>
-        <w:rPr>
-          <w:sz w:val="21"/>
-          <w:szCs w:val="21"/>
-        </w:rPr>
-        <w:t>wanted to pursue for many years, I initially lacked the skills to turn that interest into a career. I</w:t>
-      </w:r>
-      <w:r>
-        <w:rPr>
-          <w:sz w:val="21"/>
-          <w:szCs w:val="21"/>
-        </w:rPr>
-        <w:t xml:space="preserve"> </w:t>
-      </w:r>
-      <w:r>
-        <w:rPr>
-          <w:sz w:val="21"/>
-          <w:szCs w:val="21"/>
-        </w:rPr>
-        <w:t>develop</w:t>
-      </w:r>
-      <w:r>
-        <w:rPr>
-          <w:sz w:val="21"/>
-          <w:szCs w:val="21"/>
-        </w:rPr>
-        <w:t>ed</w:t>
-      </w:r>
-      <w:r>
-        <w:rPr>
-          <w:sz w:val="21"/>
-          <w:szCs w:val="21"/>
-        </w:rPr>
-        <w:t xml:space="preserve"> those skills through Northcoders, building on my previous computing background and experience working in structured, data-focused environments</w:t>
-      </w:r>
-      <w:r>
-        <w:rPr>
-          <w:sz w:val="21"/>
-          <w:szCs w:val="21"/>
-        </w:rPr>
-        <w:t>.</w:t>
+        <w:t>Since completing the bootcamp, I have continued developing independently by extending and</w:t>
+      </w:r>
+      <w:r>
+        <w:rPr>
+          <w:sz w:val="21"/>
+          <w:szCs w:val="21"/>
+        </w:rPr>
+        <w:t xml:space="preserve"> deploying</w:t>
+      </w:r>
+      <w:r>
+        <w:rPr>
+          <w:sz w:val="21"/>
+          <w:szCs w:val="21"/>
+        </w:rPr>
+        <w:t xml:space="preserve"> my projects and creating my own portfolio website to showcase my work. </w:t>
+      </w:r>
+      <w:r>
+        <w:rPr>
+          <w:sz w:val="21"/>
+          <w:szCs w:val="21"/>
+        </w:rPr>
+        <w:t xml:space="preserve">I am looking forward to </w:t>
+      </w:r>
+      <w:r>
+        <w:rPr>
+          <w:sz w:val="21"/>
+          <w:szCs w:val="21"/>
+        </w:rPr>
+        <w:t>putting</w:t>
+      </w:r>
+      <w:r>
+        <w:rPr>
+          <w:sz w:val="21"/>
+          <w:szCs w:val="21"/>
+        </w:rPr>
+        <w:t xml:space="preserve"> my skills in</w:t>
+      </w:r>
+      <w:r>
+        <w:rPr>
+          <w:sz w:val="21"/>
+          <w:szCs w:val="21"/>
+        </w:rPr>
+        <w:t xml:space="preserve">to practice, </w:t>
+      </w:r>
+      <w:r>
+        <w:rPr>
+          <w:sz w:val="21"/>
+          <w:szCs w:val="21"/>
+        </w:rPr>
+        <w:t xml:space="preserve">continuing to develop as a software </w:t>
+      </w:r>
+      <w:r>
+        <w:rPr>
+          <w:sz w:val="21"/>
+          <w:szCs w:val="21"/>
+        </w:rPr>
+        <w:t>developer</w:t>
+      </w:r>
+      <w:r>
+        <w:rPr>
+          <w:sz w:val="21"/>
+          <w:szCs w:val="21"/>
+        </w:rPr>
+        <w:t xml:space="preserve">, and contributing as a valued member of </w:t>
+      </w:r>
+      <w:r>
+        <w:rPr>
+          <w:sz w:val="21"/>
+          <w:szCs w:val="21"/>
+        </w:rPr>
+        <w:t>my</w:t>
+      </w:r>
+      <w:r>
+        <w:rPr>
+          <w:sz w:val="21"/>
+          <w:szCs w:val="21"/>
+        </w:rPr>
+        <w:t xml:space="preserve"> team.</w:t>
       </w:r>
     </w:p>
     <w:p>
@@ -511,125 +420,11 @@
         <w:ind w:left="0" w:firstLine="0"/>
         <w:jc w:val="both"/>
         <w:rPr>
-          <w:sz w:val="10"/>
-          <w:szCs w:val="10"/>
-        </w:rPr>
-      </w:pPr>
-    </w:p>
-    <w:p>
-      <w:pPr>
-        <w:spacing w:after="0" w:line="240" w:lineRule="auto"/>
-        <w:ind w:left="0" w:firstLine="0"/>
-        <w:jc w:val="both"/>
-        <w:rPr>
-          <w:sz w:val="21"/>
-          <w:szCs w:val="21"/>
-        </w:rPr>
-      </w:pPr>
-      <w:r>
-        <w:rPr>
-          <w:sz w:val="21"/>
-          <w:szCs w:val="21"/>
-        </w:rPr>
-        <w:t>Since completing the bootcamp, I have continued developing independently by extending and</w:t>
-      </w:r>
-      <w:r>
-        <w:rPr>
-          <w:sz w:val="21"/>
-          <w:szCs w:val="21"/>
-        </w:rPr>
-        <w:t xml:space="preserve"> deploying</w:t>
-      </w:r>
-      <w:r>
-        <w:rPr>
-          <w:sz w:val="21"/>
-          <w:szCs w:val="21"/>
-        </w:rPr>
-        <w:t xml:space="preserve"> my projects and creating my own portfolio website to showcase my work. </w:t>
-      </w:r>
-      <w:r>
-        <w:rPr>
-          <w:sz w:val="21"/>
-          <w:szCs w:val="21"/>
-        </w:rPr>
-        <w:t xml:space="preserve">I am looking forward to </w:t>
-      </w:r>
-      <w:r>
-        <w:rPr>
-          <w:sz w:val="21"/>
-          <w:szCs w:val="21"/>
-        </w:rPr>
-        <w:t>putting</w:t>
-      </w:r>
-      <w:r>
-        <w:rPr>
-          <w:sz w:val="21"/>
-          <w:szCs w:val="21"/>
-        </w:rPr>
-        <w:t xml:space="preserve"> my skills in</w:t>
-      </w:r>
-      <w:r>
-        <w:rPr>
-          <w:sz w:val="21"/>
-          <w:szCs w:val="21"/>
-        </w:rPr>
-        <w:t xml:space="preserve">to practice, </w:t>
-      </w:r>
-      <w:r>
-        <w:rPr>
-          <w:sz w:val="21"/>
-          <w:szCs w:val="21"/>
-        </w:rPr>
-        <w:t xml:space="preserve">continuing to develop as a software </w:t>
-      </w:r>
-      <w:r>
-        <w:rPr>
-          <w:sz w:val="21"/>
-          <w:szCs w:val="21"/>
-        </w:rPr>
-        <w:t>developer</w:t>
-      </w:r>
-      <w:r>
-        <w:rPr>
-          <w:sz w:val="21"/>
-          <w:szCs w:val="21"/>
-        </w:rPr>
-        <w:t xml:space="preserve">, and contributing as a valued member of </w:t>
-      </w:r>
-      <w:r>
-        <w:rPr>
-          <w:sz w:val="21"/>
-          <w:szCs w:val="21"/>
-        </w:rPr>
-        <w:t>my</w:t>
-      </w:r>
-      <w:r>
-        <w:rPr>
-          <w:sz w:val="21"/>
-          <w:szCs w:val="21"/>
-        </w:rPr>
-        <w:t xml:space="preserve"> team.</w:t>
-      </w:r>
-    </w:p>
-    <w:p>
-      <w:pPr>
-        <w:spacing w:after="0" w:line="240" w:lineRule="auto"/>
-        <w:ind w:left="0" w:firstLine="0"/>
-        <w:jc w:val="both"/>
-        <w:rPr>
-          <w:b/>
+          <w:bCs/>
           <w:sz w:val="16"/>
           <w:szCs w:val="16"/>
         </w:rPr>
       </w:pPr>
-      <w:r>
-        <w:rPr>
-          <w:b/>
-          <w:sz w:val="16"/>
-          <w:szCs w:val="16"/>
-        </w:rPr>
-        <w:t xml:space="preserve"> </w:t>
-      </w:r>
     </w:p>
     <w:p>
       <w:pPr>
@@ -1496,7 +1291,7 @@
           <w:sz w:val="21"/>
           <w:szCs w:val="21"/>
         </w:rPr>
-        <w:t>Collaborated in a team to build a productivity application that combines lo-fi music with tools including music search, playlists, timers, projects and user accounts</w:t>
+        <w:t>Collaborated in a team to build a full-stack productivity application that combines lo-fi music with tools designed to help users organise and manage their work</w:t>
       </w:r>
     </w:p>
     <w:p>
@@ -1519,7 +1314,7 @@
           <w:sz w:val="21"/>
           <w:szCs w:val="21"/>
         </w:rPr>
-        <w:t>Pair programmed on the YouTube integration, enabling users to search for music and play selected videos within the application, while also contributing to backend functionality, testing and dashboard features</w:t>
+        <w:t>Built features that allow users to search and play music, create playlists, use a Pomodoro timer, manage projects and maintain their own user account</w:t>
       </w:r>
     </w:p>
     <w:p>
@@ -1542,141 +1337,7 @@
           <w:sz w:val="21"/>
           <w:szCs w:val="21"/>
         </w:rPr>
-        <w:t>Independently implemented API and database health checks to monitor whether key parts of the application were running correctly, and developed a Pomodoro timer prototype that controlled music playback based on a 25-minute focus session</w:t>
-      </w:r>
-    </w:p>
-    <w:p>
-      <w:pPr>
-        <w:pStyle w:val="ListParagraph"/>
-        <w:numPr>
-          <w:ilvl w:val="0"/>
-          <w:numId w:val="18"/>
-        </w:numPr>
-        <w:spacing w:after="0" w:line="240" w:lineRule="auto"/>
-        <w:ind w:left="357" w:hanging="357"/>
-        <w:jc w:val="both"/>
-        <w:rPr>
-          <w:sz w:val="21"/>
-          <w:szCs w:val="21"/>
-        </w:rPr>
-      </w:pPr>
-      <w:r>
-        <w:rPr>
-          <w:sz w:val="21"/>
-          <w:szCs w:val="21"/>
-        </w:rPr>
-        <w:t xml:space="preserve">Independently reviewed the application for security weaknesses and fixed issues that could have allowed users to access or modify other users' information, including preventing users from giving themselves administrator privileges or accessing </w:t>
-      </w:r>
-      <w:r>
-        <w:rPr>
-          <w:sz w:val="21"/>
-          <w:szCs w:val="21"/>
-        </w:rPr>
-        <w:t>and modifying</w:t>
-      </w:r>
-      <w:r>
-        <w:rPr>
-          <w:sz w:val="21"/>
-          <w:szCs w:val="21"/>
-        </w:rPr>
-        <w:t xml:space="preserve"> </w:t>
-      </w:r>
-      <w:r>
-        <w:rPr>
-          <w:sz w:val="21"/>
-          <w:szCs w:val="21"/>
-        </w:rPr>
-        <w:t>other users' projects</w:t>
-      </w:r>
-    </w:p>
-    <w:p>
-      <w:pPr>
-        <w:pStyle w:val="ListParagraph"/>
-        <w:numPr>
-          <w:ilvl w:val="0"/>
-          <w:numId w:val="18"/>
-        </w:numPr>
-        <w:spacing w:after="0" w:line="240" w:lineRule="auto"/>
-        <w:ind w:left="357" w:hanging="357"/>
-        <w:jc w:val="both"/>
-        <w:rPr>
-          <w:sz w:val="21"/>
-          <w:szCs w:val="21"/>
-        </w:rPr>
-      </w:pPr>
-      <w:r>
-        <w:rPr>
-          <w:sz w:val="21"/>
-          <w:szCs w:val="21"/>
-        </w:rPr>
-        <w:t xml:space="preserve">Reworked the sign-up and login process to use email addresses consistently with the authentication system, fixing account-creation and login issues and ensuring new user accounts were correctly </w:t>
-      </w:r>
-      <w:r>
-        <w:rPr>
-          <w:sz w:val="21"/>
-          <w:szCs w:val="21"/>
-        </w:rPr>
-        <w:t>linked</w:t>
-      </w:r>
-      <w:r>
-        <w:rPr>
-          <w:sz w:val="21"/>
-          <w:szCs w:val="21"/>
-        </w:rPr>
-        <w:t xml:space="preserve"> to their authentication </w:t>
-      </w:r>
-      <w:r>
-        <w:rPr>
-          <w:sz w:val="21"/>
-          <w:szCs w:val="21"/>
-        </w:rPr>
-        <w:t>accounts</w:t>
-      </w:r>
-    </w:p>
-    <w:p>
-      <w:pPr>
-        <w:pStyle w:val="ListParagraph"/>
-        <w:numPr>
-          <w:ilvl w:val="0"/>
-          <w:numId w:val="18"/>
-        </w:numPr>
-        <w:spacing w:after="0" w:line="240" w:lineRule="auto"/>
-        <w:ind w:left="357" w:hanging="357"/>
-        <w:jc w:val="both"/>
-        <w:rPr>
-          <w:sz w:val="21"/>
-          <w:szCs w:val="21"/>
-        </w:rPr>
-      </w:pPr>
-      <w:r>
-        <w:rPr>
-          <w:sz w:val="21"/>
-          <w:szCs w:val="21"/>
-        </w:rPr>
-        <w:t>Restored the YouTube music search after the bootcamp, replacing temporary hard-coded videos with live search results and adding a 15-minute cache to reduce repeated requests to the external service</w:t>
-      </w:r>
-    </w:p>
-    <w:p>
-      <w:pPr>
-        <w:pStyle w:val="ListParagraph"/>
-        <w:numPr>
-          <w:ilvl w:val="0"/>
-          <w:numId w:val="18"/>
-        </w:numPr>
-        <w:spacing w:after="0" w:line="240" w:lineRule="auto"/>
-        <w:ind w:left="357" w:hanging="357"/>
-        <w:jc w:val="both"/>
-        <w:rPr>
-          <w:sz w:val="21"/>
-          <w:szCs w:val="21"/>
-        </w:rPr>
-      </w:pPr>
-      <w:r>
-        <w:rPr>
-          <w:sz w:val="21"/>
-          <w:szCs w:val="21"/>
-        </w:rPr>
-        <w:t>Completed and reintroduced the Pomodoro timer, fixed an existing playback issue, and deployed the completed application online using Docker and Railway with Azure SQL providing the production database</w:t>
+        <w:t>Continued developing the application independently after the bootcamp, improving its functionality and security before deploying the completed application online</w:t>
       </w:r>
     </w:p>
     <w:p>
@@ -2013,73 +1674,13 @@
           <w:sz w:val="21"/>
           <w:szCs w:val="21"/>
         </w:rPr>
-        <w:lastRenderedPageBreak/>
-        <w:t>Developed the application so changes made through the user interface are processed by the backend and stored persistently, keeping record information available between sessions</w:t>
-      </w:r>
-    </w:p>
-    <w:p>
-      <w:pPr>
-        <w:pStyle w:val="ListParagraph"/>
-        <w:numPr>
-          <w:ilvl w:val="0"/>
-          <w:numId w:val="18"/>
-        </w:numPr>
-        <w:spacing w:after="0" w:line="240" w:lineRule="auto"/>
-        <w:ind w:left="357" w:hanging="357"/>
-        <w:jc w:val="both"/>
-        <w:rPr>
-          <w:sz w:val="21"/>
-          <w:szCs w:val="21"/>
-        </w:rPr>
-      </w:pPr>
-      <w:r>
-        <w:rPr>
-          <w:sz w:val="21"/>
-          <w:szCs w:val="21"/>
-        </w:rPr>
-        <w:t>Added automated testing and health checks to verify that key parts of the application behave correctly and to help identify problems with the application or database</w:t>
-      </w:r>
-    </w:p>
-    <w:p>
-      <w:pPr>
-        <w:pStyle w:val="ListParagraph"/>
-        <w:numPr>
-          <w:ilvl w:val="0"/>
-          <w:numId w:val="18"/>
-        </w:numPr>
-        <w:spacing w:after="0" w:line="240" w:lineRule="auto"/>
-        <w:ind w:left="357" w:hanging="357"/>
-        <w:jc w:val="both"/>
-        <w:rPr>
-          <w:sz w:val="21"/>
-          <w:szCs w:val="21"/>
-        </w:rPr>
-      </w:pPr>
-      <w:r>
-        <w:rPr>
-          <w:sz w:val="21"/>
-          <w:szCs w:val="21"/>
-        </w:rPr>
-        <w:t>Deployed the completed application online using</w:t>
-      </w:r>
-      <w:r>
-        <w:rPr>
-          <w:sz w:val="21"/>
-          <w:szCs w:val="21"/>
-        </w:rPr>
-        <w:t xml:space="preserve"> Docker and</w:t>
-      </w:r>
-      <w:r>
-        <w:rPr>
-          <w:sz w:val="21"/>
-          <w:szCs w:val="21"/>
-        </w:rPr>
-        <w:t xml:space="preserve"> Railway, with the frontend and backend running as separate services and a Neon PostgreSQL database providing persistent production data</w:t>
-      </w:r>
-    </w:p>
-    <w:p>
-      <w:pPr>
-        <w:spacing w:after="0" w:line="240" w:lineRule="auto"/>
+        <w:t>Added automated testing and health checks to help ensure the application and database work correctly, before deploying the completed application online</w:t>
+      </w:r>
+    </w:p>
+    <w:p>
+      <w:pPr>
+        <w:spacing w:after="0" w:line="240" w:lineRule="auto"/>
+        <w:ind w:left="0" w:firstLine="0"/>
         <w:jc w:val="both"/>
         <w:rPr>
           <w:sz w:val="16"/>
@@ -2367,7 +1968,21 @@
           <w:sz w:val="21"/>
           <w:szCs w:val="21"/>
         </w:rPr>
-        <w:t xml:space="preserve"> backend applications and REST APIs using ASP.NET Core</w:t>
+        <w:t xml:space="preserve"> </w:t>
+      </w:r>
+      <w:r>
+        <w:rPr>
+          <w:sz w:val="21"/>
+          <w:szCs w:val="21"/>
+        </w:rPr>
+        <w:t>full-stack</w:t>
+      </w:r>
+      <w:r>
+        <w:rPr>
+          <w:sz w:val="21"/>
+          <w:szCs w:val="21"/>
+        </w:rPr>
+        <w:t xml:space="preserve"> applications and REST APIs using ASP.NET Core</w:t>
       </w:r>
     </w:p>
     <w:p>
@@ -2598,15 +2213,18 @@
           <w:szCs w:val="21"/>
         </w:rPr>
       </w:pPr>
-      <w:r>
+    </w:p>
+    <w:p>
+      <w:pPr>
+        <w:spacing w:after="0" w:line="240" w:lineRule="auto"/>
+        <w:jc w:val="both"/>
         <w:rPr>
           <w:b/>
           <w:bCs/>
           <w:sz w:val="21"/>
           <w:szCs w:val="21"/>
         </w:rPr>
-        <w:t>Google IT Support Professional Certificate (</w:t>
-      </w:r>
+      </w:pPr>
       <w:r>
         <w:rPr>
           <w:b/>
@@ -2614,7 +2232,8 @@
           <w:sz w:val="21"/>
           <w:szCs w:val="21"/>
         </w:rPr>
-        <w:t xml:space="preserve">Coursera) </w:t>
+        <w:lastRenderedPageBreak/>
+        <w:t>Google IT Support Professional Certificate (</w:t>
       </w:r>
       <w:r>
         <w:rPr>
@@ -2623,7 +2242,7 @@
           <w:sz w:val="21"/>
           <w:szCs w:val="21"/>
         </w:rPr>
-        <w:tab/>
+        <w:t xml:space="preserve">Coursera) </w:t>
       </w:r>
       <w:r>
         <w:rPr>
@@ -2659,7 +2278,14 @@
           <w:sz w:val="21"/>
           <w:szCs w:val="21"/>
         </w:rPr>
-        <w:tab/>
+        <w:t xml:space="preserve">        </w:t>
+      </w:r>
+      <w:r>
+        <w:rPr>
+          <w:sz w:val="21"/>
+          <w:szCs w:val="21"/>
+        </w:rPr>
+        <w:t>Self Study | Aug</w:t>
       </w:r>
       <w:r>
         <w:rPr>
@@ -2668,15 +2294,28 @@
           <w:sz w:val="21"/>
           <w:szCs w:val="21"/>
         </w:rPr>
-        <w:tab/>
-        <w:t xml:space="preserve">            </w:t>
-      </w:r>
-      <w:r>
-        <w:rPr>
-          <w:sz w:val="21"/>
-          <w:szCs w:val="21"/>
-        </w:rPr>
-        <w:t xml:space="preserve">2023  </w:t>
+        <w:t xml:space="preserve"> </w:t>
+      </w:r>
+      <w:r>
+        <w:rPr>
+          <w:sz w:val="21"/>
+          <w:szCs w:val="21"/>
+        </w:rPr>
+        <w:t>2023</w:t>
+      </w:r>
+      <w:r>
+        <w:rPr>
+          <w:sz w:val="21"/>
+          <w:szCs w:val="21"/>
+        </w:rPr>
+        <w:t xml:space="preserve"> – Sep 2023</w:t>
+      </w:r>
+      <w:r>
+        <w:rPr>
+          <w:sz w:val="21"/>
+          <w:szCs w:val="21"/>
+        </w:rPr>
+        <w:t xml:space="preserve">  </w:t>
       </w:r>
     </w:p>
     <w:p>
@@ -3734,70 +3373,56 @@
           <w:sz w:val="21"/>
           <w:szCs w:val="21"/>
         </w:rPr>
-        <w:t xml:space="preserve">Building </w:t>
-      </w:r>
-      <w:r>
-        <w:rPr>
-          <w:sz w:val="21"/>
-          <w:szCs w:val="21"/>
-        </w:rPr>
-        <w:t xml:space="preserve">personal </w:t>
-      </w:r>
-      <w:r>
-        <w:rPr>
-          <w:sz w:val="21"/>
-          <w:szCs w:val="21"/>
-        </w:rPr>
-        <w:t>coding projects</w:t>
-      </w:r>
-      <w:r>
-        <w:rPr>
-          <w:sz w:val="21"/>
-          <w:szCs w:val="21"/>
-        </w:rPr>
-        <w:t xml:space="preserve"> to strengthen</w:t>
-      </w:r>
-      <w:r>
-        <w:rPr>
-          <w:sz w:val="21"/>
-          <w:szCs w:val="21"/>
-        </w:rPr>
-        <w:t xml:space="preserve"> my C#/.NET skills</w:t>
-      </w:r>
-      <w:r>
-        <w:rPr>
-          <w:sz w:val="21"/>
-          <w:szCs w:val="21"/>
-        </w:rPr>
-        <w:t xml:space="preserve"> and</w:t>
-      </w:r>
-      <w:r>
-        <w:rPr>
-          <w:sz w:val="21"/>
-          <w:szCs w:val="21"/>
-        </w:rPr>
-        <w:t xml:space="preserve"> apply concepts in real</w:t>
-      </w:r>
-      <w:r>
-        <w:rPr>
-          <w:sz w:val="21"/>
-          <w:szCs w:val="21"/>
-        </w:rPr>
-        <w:t>-world</w:t>
-      </w:r>
-      <w:r>
-        <w:rPr>
-          <w:sz w:val="21"/>
-          <w:szCs w:val="21"/>
-        </w:rPr>
-        <w:t xml:space="preserve"> scenarios</w:t>
-      </w:r>
-      <w:r>
-        <w:rPr>
-          <w:sz w:val="21"/>
-          <w:szCs w:val="21"/>
-        </w:rPr>
-        <w:t xml:space="preserve"> </w:t>
+        <w:t xml:space="preserve">Strength </w:t>
+      </w:r>
+      <w:r>
+        <w:rPr>
+          <w:sz w:val="21"/>
+          <w:szCs w:val="21"/>
+        </w:rPr>
+        <w:t>t</w:t>
+      </w:r>
+      <w:r>
+        <w:rPr>
+          <w:sz w:val="21"/>
+          <w:szCs w:val="21"/>
+        </w:rPr>
+        <w:t>raining</w:t>
+      </w:r>
+      <w:r>
+        <w:rPr>
+          <w:sz w:val="21"/>
+          <w:szCs w:val="21"/>
+        </w:rPr>
+        <w:t>, c</w:t>
+      </w:r>
+      <w:r>
+        <w:rPr>
+          <w:sz w:val="21"/>
+          <w:szCs w:val="21"/>
+        </w:rPr>
+        <w:t>ardio</w:t>
+      </w:r>
+      <w:r>
+        <w:rPr>
+          <w:sz w:val="21"/>
+          <w:szCs w:val="21"/>
+        </w:rPr>
+        <w:t xml:space="preserve"> and healthy eating</w:t>
+      </w:r>
+      <w:r>
+        <w:rPr>
+          <w:sz w:val="21"/>
+          <w:szCs w:val="21"/>
+        </w:rPr>
+        <w:t xml:space="preserve"> – built a consistent routine after recognising the importance of long-term health, improving discipline and lifestyle </w:t>
+      </w:r>
+      <w:r>
+        <w:rPr>
+          <w:sz w:val="21"/>
+          <w:szCs w:val="21"/>
+        </w:rPr>
+        <w:t>habits</w:t>
       </w:r>
     </w:p>
     <w:p>
@@ -3820,21 +3445,70 @@
           <w:sz w:val="21"/>
           <w:szCs w:val="21"/>
         </w:rPr>
-        <w:t xml:space="preserve">Building and upgrading </w:t>
-      </w:r>
-      <w:r>
-        <w:rPr>
-          <w:sz w:val="21"/>
-          <w:szCs w:val="21"/>
-        </w:rPr>
-        <w:t>computer systems</w:t>
-      </w:r>
-      <w:r>
-        <w:rPr>
-          <w:sz w:val="21"/>
-          <w:szCs w:val="21"/>
-        </w:rPr>
-        <w:t xml:space="preserve"> – interested in how hardware components work together and impact system performance</w:t>
+        <w:t xml:space="preserve">Building </w:t>
+      </w:r>
+      <w:r>
+        <w:rPr>
+          <w:sz w:val="21"/>
+          <w:szCs w:val="21"/>
+        </w:rPr>
+        <w:t xml:space="preserve">personal </w:t>
+      </w:r>
+      <w:r>
+        <w:rPr>
+          <w:sz w:val="21"/>
+          <w:szCs w:val="21"/>
+        </w:rPr>
+        <w:t>coding projects</w:t>
+      </w:r>
+      <w:r>
+        <w:rPr>
+          <w:sz w:val="21"/>
+          <w:szCs w:val="21"/>
+        </w:rPr>
+        <w:t xml:space="preserve"> to strengthen</w:t>
+      </w:r>
+      <w:r>
+        <w:rPr>
+          <w:sz w:val="21"/>
+          <w:szCs w:val="21"/>
+        </w:rPr>
+        <w:t xml:space="preserve"> my C#/.NET skills</w:t>
+      </w:r>
+      <w:r>
+        <w:rPr>
+          <w:sz w:val="21"/>
+          <w:szCs w:val="21"/>
+        </w:rPr>
+        <w:t xml:space="preserve"> and</w:t>
+      </w:r>
+      <w:r>
+        <w:rPr>
+          <w:sz w:val="21"/>
+          <w:szCs w:val="21"/>
+        </w:rPr>
+        <w:t xml:space="preserve"> apply concepts in real</w:t>
+      </w:r>
+      <w:r>
+        <w:rPr>
+          <w:sz w:val="21"/>
+          <w:szCs w:val="21"/>
+        </w:rPr>
+        <w:t>-world</w:t>
+      </w:r>
+      <w:r>
+        <w:rPr>
+          <w:sz w:val="21"/>
+          <w:szCs w:val="21"/>
+        </w:rPr>
+        <w:t xml:space="preserve"> scenarios</w:t>
+      </w:r>
+      <w:r>
+        <w:rPr>
+          <w:sz w:val="21"/>
+          <w:szCs w:val="21"/>
+        </w:rPr>
+        <w:t xml:space="preserve"> </w:t>
       </w:r>
     </w:p>
     <w:p>
@@ -3857,56 +3531,21 @@
           <w:sz w:val="21"/>
           <w:szCs w:val="21"/>
         </w:rPr>
-        <w:t xml:space="preserve">Strength </w:t>
-      </w:r>
-      <w:r>
-        <w:rPr>
-          <w:sz w:val="21"/>
-          <w:szCs w:val="21"/>
-        </w:rPr>
-        <w:t>t</w:t>
-      </w:r>
-      <w:r>
-        <w:rPr>
-          <w:sz w:val="21"/>
-          <w:szCs w:val="21"/>
-        </w:rPr>
-        <w:t>raining</w:t>
-      </w:r>
-      <w:r>
-        <w:rPr>
-          <w:sz w:val="21"/>
-          <w:szCs w:val="21"/>
-        </w:rPr>
-        <w:t>, c</w:t>
-      </w:r>
-      <w:r>
-        <w:rPr>
-          <w:sz w:val="21"/>
-          <w:szCs w:val="21"/>
-        </w:rPr>
-        <w:t>ardio</w:t>
-      </w:r>
-      <w:r>
-        <w:rPr>
-          <w:sz w:val="21"/>
-          <w:szCs w:val="21"/>
-        </w:rPr>
-        <w:t xml:space="preserve"> and healthy eating</w:t>
-      </w:r>
-      <w:r>
-        <w:rPr>
-          <w:sz w:val="21"/>
-          <w:szCs w:val="21"/>
-        </w:rPr>
-        <w:t xml:space="preserve"> – built a consistent routine after recognising the importance of long-term health, improving discipline and lifestyle </w:t>
-      </w:r>
-      <w:r>
-        <w:rPr>
-          <w:sz w:val="21"/>
-          <w:szCs w:val="21"/>
-        </w:rPr>
-        <w:t>habits</w:t>
+        <w:t xml:space="preserve">Building and upgrading </w:t>
+      </w:r>
+      <w:r>
+        <w:rPr>
+          <w:sz w:val="21"/>
+          <w:szCs w:val="21"/>
+        </w:rPr>
+        <w:t>computer systems</w:t>
+      </w:r>
+      <w:r>
+        <w:rPr>
+          <w:sz w:val="21"/>
+          <w:szCs w:val="21"/>
+        </w:rPr>
+        <w:t xml:space="preserve"> – interested in how hardware components work together and impact system performance</w:t>
       </w:r>
     </w:p>
     <w:p>

</xml_diff>

<commit_message>
docs: update CV with profile changes
</commit_message>
<xml_diff>
--- a/Nazmul_Hussain_CV.docx
+++ b/Nazmul_Hussain_CV.docx
@@ -298,28 +298,49 @@
           <w:sz w:val="21"/>
           <w:szCs w:val="21"/>
         </w:rPr>
-        <w:t>My interest in computers started young</w:t>
-      </w:r>
-      <w:r>
-        <w:rPr>
-          <w:sz w:val="21"/>
-          <w:szCs w:val="21"/>
-        </w:rPr>
-        <w:t xml:space="preserve"> </w:t>
-      </w:r>
-      <w:r>
-        <w:rPr>
-          <w:sz w:val="21"/>
-          <w:szCs w:val="21"/>
-        </w:rPr>
-        <w:t>—</w:t>
-      </w:r>
-      <w:r>
-        <w:rPr>
-          <w:sz w:val="21"/>
-          <w:szCs w:val="21"/>
-        </w:rPr>
-        <w:t xml:space="preserve"> I'd spend hours digging through settings and system menus just to see what everything did, and upgrading my first PC's RAM taught me how much of a difference understanding the hardware makes. That curiosity eventually pulled me toward software, where I found what I enjoy most: a clear set of rules that, once learned, do exactly what you tell them to. I'm a systematic person who likes following a structured process through to a working result, and that mindset carried me through the Northcoders Enterprise Engineering bootcamp and the independent work I've built on since. I'm looking to bring that same curiosity and structured approach to a development team</w:t>
+        <w:t xml:space="preserve">My </w:t>
+      </w:r>
+      <w:r>
+        <w:rPr>
+          <w:sz w:val="21"/>
+          <w:szCs w:val="21"/>
+        </w:rPr>
+        <w:t>curiosity about</w:t>
+      </w:r>
+      <w:r>
+        <w:rPr>
+          <w:sz w:val="21"/>
+          <w:szCs w:val="21"/>
+        </w:rPr>
+        <w:t xml:space="preserve"> computers started young</w:t>
+      </w:r>
+      <w:r>
+        <w:rPr>
+          <w:sz w:val="21"/>
+          <w:szCs w:val="21"/>
+        </w:rPr>
+        <w:t xml:space="preserve">. </w:t>
+      </w:r>
+      <w:r>
+        <w:rPr>
+          <w:sz w:val="21"/>
+          <w:szCs w:val="21"/>
+        </w:rPr>
+        <w:t xml:space="preserve">I'd spend hours digging through settings and system menus just to see what everything did, and upgrading my first PC's RAM taught me how much of a difference understanding the hardware makes. That pulled me toward software, where I found what I enjoy most: a clear set of rules that, once learned, do exactly what you tell them to. I'm a systematic person who likes following a structured process through to a working result, and that mindset carried me through the Northcoders Enterprise Engineering bootcamp and the independent work I've built on since. I'm looking to bring that same </w:t>
+      </w:r>
+      <w:r>
+        <w:rPr>
+          <w:sz w:val="21"/>
+          <w:szCs w:val="21"/>
+        </w:rPr>
+        <w:t>mindset</w:t>
+      </w:r>
+      <w:r>
+        <w:rPr>
+          <w:sz w:val="21"/>
+          <w:szCs w:val="21"/>
+        </w:rPr>
+        <w:t xml:space="preserve"> and structured approach to a development team</w:t>
       </w:r>
       <w:r>
         <w:rPr>
@@ -1226,14 +1247,7 @@
           <w:sz w:val="21"/>
           <w:szCs w:val="21"/>
         </w:rPr>
-        <w:t xml:space="preserve"> </w:t>
-      </w:r>
-      <w:r>
-        <w:rPr>
-          <w:sz w:val="21"/>
-          <w:szCs w:val="21"/>
-        </w:rPr>
-        <w:t>—</w:t>
+        <w:t>, and</w:t>
       </w:r>
       <w:r>
         <w:rPr>
@@ -1690,14 +1704,14 @@
           <w:sz w:val="21"/>
           <w:szCs w:val="21"/>
         </w:rPr>
-        <w:t xml:space="preserve"> -</w:t>
-      </w:r>
-      <w:r>
-        <w:rPr>
-          <w:sz w:val="21"/>
-          <w:szCs w:val="21"/>
-        </w:rPr>
-        <w:t xml:space="preserve"> data access, business logic and API responses</w:t>
+        <w:t xml:space="preserve">: </w:t>
+      </w:r>
+      <w:r>
+        <w:rPr>
+          <w:sz w:val="21"/>
+          <w:szCs w:val="21"/>
+        </w:rPr>
+        <w:t>data access, business logic and API responses</w:t>
       </w:r>
       <w:r>
         <w:rPr>
@@ -3399,7 +3413,14 @@
           <w:sz w:val="21"/>
           <w:szCs w:val="21"/>
         </w:rPr>
-        <w:t xml:space="preserve"> – built a consistent routine after recognising the importance of long-term health, improving discipline and lifestyle </w:t>
+        <w:t>:</w:t>
+      </w:r>
+      <w:r>
+        <w:rPr>
+          <w:sz w:val="21"/>
+          <w:szCs w:val="21"/>
+        </w:rPr>
+        <w:t xml:space="preserve"> built a consistent routine after recognising the importance of long-term health, improving discipline and lifestyle </w:t>
       </w:r>
       <w:r>
         <w:rPr>
@@ -3529,7 +3550,14 @@
           <w:sz w:val="21"/>
           <w:szCs w:val="21"/>
         </w:rPr>
-        <w:t xml:space="preserve"> – interested in how hardware components work together and impact system performance</w:t>
+        <w:t>:</w:t>
+      </w:r>
+      <w:r>
+        <w:rPr>
+          <w:sz w:val="21"/>
+          <w:szCs w:val="21"/>
+        </w:rPr>
+        <w:t xml:space="preserve"> interested in how hardware components work together and impact system performance</w:t>
       </w:r>
     </w:p>
     <w:p>
@@ -7371,6 +7399,7 @@
   <w:style w:type="character" w:default="1" w:styleId="DefaultParagraphFont">
     <w:name w:val="Default Paragraph Font"/>
     <w:uiPriority w:val="1"/>
+    <w:semiHidden/>
     <w:unhideWhenUsed/>
   </w:style>
   <w:style w:type="table" w:default="1" w:styleId="TableNormal">

</xml_diff>

<commit_message>
docs: update CV with profile/interest changes
</commit_message>
<xml_diff>
--- a/Nazmul_Hussain_CV.docx
+++ b/Nazmul_Hussain_CV.docx
@@ -305,14 +305,42 @@
           <w:sz w:val="21"/>
           <w:szCs w:val="21"/>
         </w:rPr>
-        <w:t>curiosity about</w:t>
-      </w:r>
-      <w:r>
-        <w:rPr>
-          <w:sz w:val="21"/>
-          <w:szCs w:val="21"/>
-        </w:rPr>
-        <w:t xml:space="preserve"> computers started young</w:t>
+        <w:t>curiosity</w:t>
+      </w:r>
+      <w:r>
+        <w:rPr>
+          <w:sz w:val="21"/>
+          <w:szCs w:val="21"/>
+        </w:rPr>
+        <w:t xml:space="preserve"> in</w:t>
+      </w:r>
+      <w:r>
+        <w:rPr>
+          <w:sz w:val="21"/>
+          <w:szCs w:val="21"/>
+        </w:rPr>
+        <w:t xml:space="preserve"> computers started </w:t>
+      </w:r>
+      <w:r>
+        <w:rPr>
+          <w:sz w:val="21"/>
+          <w:szCs w:val="21"/>
+        </w:rPr>
+        <w:t xml:space="preserve">at a </w:t>
+      </w:r>
+      <w:r>
+        <w:rPr>
+          <w:sz w:val="21"/>
+          <w:szCs w:val="21"/>
+        </w:rPr>
+        <w:t>young</w:t>
+      </w:r>
+      <w:r>
+        <w:rPr>
+          <w:sz w:val="21"/>
+          <w:szCs w:val="21"/>
+        </w:rPr>
+        <w:t xml:space="preserve"> age</w:t>
       </w:r>
       <w:r>
         <w:rPr>
@@ -3413,7 +3441,7 @@
           <w:sz w:val="21"/>
           <w:szCs w:val="21"/>
         </w:rPr>
-        <w:t>:</w:t>
+        <w:t xml:space="preserve"> - have</w:t>
       </w:r>
       <w:r>
         <w:rPr>
@@ -3450,7 +3478,14 @@
           <w:sz w:val="21"/>
           <w:szCs w:val="21"/>
         </w:rPr>
-        <w:t xml:space="preserve">Building </w:t>
+        <w:t>Developing</w:t>
+      </w:r>
+      <w:r>
+        <w:rPr>
+          <w:sz w:val="21"/>
+          <w:szCs w:val="21"/>
+        </w:rPr>
+        <w:t xml:space="preserve"> </w:t>
       </w:r>
       <w:r>
         <w:rPr>

</xml_diff>

<commit_message>
docs: update CV with correct degree title
</commit_message>
<xml_diff>
--- a/Nazmul_Hussain_CV.docx
+++ b/Nazmul_Hussain_CV.docx
@@ -3089,7 +3089,7 @@
           <w:sz w:val="21"/>
           <w:szCs w:val="21"/>
         </w:rPr>
-        <w:t xml:space="preserve">BSc (Hons) Computer Science </w:t>
+        <w:t>Diploma of Higher Education</w:t>
       </w:r>
       <w:r>
         <w:rPr>
@@ -3098,7 +3098,7 @@
           <w:sz w:val="21"/>
           <w:szCs w:val="21"/>
         </w:rPr>
-        <w:t>| S</w:t>
+        <w:t xml:space="preserve"> (</w:t>
       </w:r>
       <w:r>
         <w:rPr>
@@ -3107,7 +3107,34 @@
           <w:sz w:val="21"/>
           <w:szCs w:val="21"/>
         </w:rPr>
-        <w:t xml:space="preserve">tudied to final year  </w:t>
+        <w:t>DipHE</w:t>
+      </w:r>
+      <w:r>
+        <w:rPr>
+          <w:b/>
+          <w:bCs/>
+          <w:sz w:val="21"/>
+          <w:szCs w:val="21"/>
+        </w:rPr>
+        <w:t xml:space="preserve">) </w:t>
+      </w:r>
+      <w:r>
+        <w:rPr>
+          <w:b/>
+          <w:bCs/>
+          <w:sz w:val="21"/>
+          <w:szCs w:val="21"/>
+        </w:rPr>
+        <w:t xml:space="preserve">in </w:t>
+      </w:r>
+      <w:r>
+        <w:rPr>
+          <w:b/>
+          <w:bCs/>
+          <w:sz w:val="21"/>
+          <w:szCs w:val="21"/>
+        </w:rPr>
+        <w:t xml:space="preserve">Computer Science  </w:t>
       </w:r>
     </w:p>
     <w:p>
@@ -3124,14 +3151,14 @@
           <w:sz w:val="21"/>
           <w:szCs w:val="21"/>
         </w:rPr>
-        <w:t xml:space="preserve">Greenwich School of </w:t>
-      </w:r>
-      <w:r>
-        <w:rPr>
-          <w:sz w:val="21"/>
-          <w:szCs w:val="21"/>
-        </w:rPr>
-        <w:t xml:space="preserve">Management </w:t>
+        <w:t>University of Plymouth (GSM London)</w:t>
+      </w:r>
+      <w:r>
+        <w:rPr>
+          <w:sz w:val="21"/>
+          <w:szCs w:val="21"/>
+        </w:rPr>
+        <w:t xml:space="preserve"> </w:t>
       </w:r>
       <w:r>
         <w:rPr>
@@ -3220,7 +3247,21 @@
           <w:sz w:val="21"/>
           <w:szCs w:val="21"/>
         </w:rPr>
-        <w:t xml:space="preserve"> Programming (Java &amp; C#), Software Engineering, Database Management Systems, Systems Analysis and Design  </w:t>
+        <w:t xml:space="preserve"> Programming (Java &amp; C#), Software Engineering, Database Management Systems,</w:t>
+      </w:r>
+      <w:r>
+        <w:rPr>
+          <w:sz w:val="21"/>
+          <w:szCs w:val="21"/>
+        </w:rPr>
+        <w:t xml:space="preserve"> Internet Development,</w:t>
+      </w:r>
+      <w:r>
+        <w:rPr>
+          <w:sz w:val="21"/>
+          <w:szCs w:val="21"/>
+        </w:rPr>
+        <w:t xml:space="preserve"> Systems Analysis and Design  </w:t>
       </w:r>
     </w:p>
     <w:p>

</xml_diff>